<commit_message>
NR-01: HSE Indicator Tool de volta como referência internacional complementar
Co-Authored-By: Claude Opus 5.5 <noreply@anthropic.com>
</commit_message>
<xml_diff>
--- a/NR01/Fontes_oficiais_e_questionarios_validados.docx
+++ b/NR01/Fontes_oficiais_e_questionarios_validados.docx
@@ -749,6 +749,80 @@
           </w:p>
         </w:tc>
       </w:tr>
+      <w:tr>
+        <w:tc>
+          <w:tcPr>
+            <w:tcW w:type="dxa" w:w="1474"/>
+          </w:tcPr>
+          <w:p>
+            <w:r/>
+            <w:r>
+              <w:rPr>
+                <w:b/>
+                <w:color w:val="0E2841"/>
+                <w:sz w:val="17"/>
+              </w:rPr>
+              <w:t>HSE Indicator Tool (referência internacional)</w:t>
+            </w:r>
+          </w:p>
+        </w:tc>
+        <w:tc>
+          <w:tcPr>
+            <w:tcW w:type="dxa" w:w="1928"/>
+          </w:tcPr>
+          <w:p>
+            <w:r/>
+            <w:r>
+              <w:rPr>
+                <w:sz w:val="17"/>
+              </w:rPr>
+              <w:t>Health and Safety Executive, governo do Reino Unido; sem validação brasileira localizada</w:t>
+            </w:r>
+          </w:p>
+        </w:tc>
+        <w:tc>
+          <w:tcPr>
+            <w:tcW w:type="dxa" w:w="1474"/>
+          </w:tcPr>
+          <w:p>
+            <w:r/>
+            <w:r>
+              <w:rPr>
+                <w:sz w:val="17"/>
+              </w:rPr>
+              <w:t>35, em 6 fatores</w:t>
+            </w:r>
+          </w:p>
+        </w:tc>
+        <w:tc>
+          <w:tcPr>
+            <w:tcW w:type="dxa" w:w="1757"/>
+          </w:tcPr>
+          <w:p>
+            <w:r/>
+            <w:r>
+              <w:rPr>
+                <w:sz w:val="17"/>
+              </w:rPr>
+              <w:t>Likert de 5 pontos</w:t>
+            </w:r>
+          </w:p>
+        </w:tc>
+        <w:tc>
+          <w:tcPr>
+            <w:tcW w:type="dxa" w:w="2778"/>
+          </w:tcPr>
+          <w:p>
+            <w:r/>
+            <w:r>
+              <w:rPr>
+                <w:sz w:val="17"/>
+              </w:rPr>
+              <w:t>Primeira aplicação, rápida e fácil de apurar</w:t>
+            </w:r>
+          </w:p>
+        </w:tc>
+      </w:tr>
     </w:tbl>
     <w:p/>
     <w:p>
@@ -1312,6 +1386,167 @@
         <w:pStyle w:val="Heading1"/>
       </w:pPr>
       <w:r>
+        <w:t>Referência internacional complementar</w:t>
+      </w:r>
+    </w:p>
+    <w:p>
+      <w:pPr>
+        <w:pStyle w:val="Heading2"/>
+      </w:pPr>
+      <w:r>
+        <w:t>HSE Management Standards Indicator Tool</w:t>
+      </w:r>
+    </w:p>
+    <w:p>
+      <w:r>
+        <w:rPr>
+          <w:i w:val="0"/>
+        </w:rPr>
+        <w:t>Desenvolvido pelo Health and Safety Executive, órgão de saúde e segurança do governo do Reino Unido, com 35 perguntas sobre seis fatores principais de estresse: demandas, controle, suporte (da chefia e dos colegas), relacionamentos, papel e mudanças. O Manual do GRO (MTE, 2026) admite ferramenta com respaldo de instituição de SST internacional; como não foi localizada validação brasileira, entra como complemento.</w:t>
+      </w:r>
+    </w:p>
+    <w:p>
+      <w:pPr>
+        <w:pStyle w:val="Heading3"/>
+      </w:pPr>
+      <w:r>
+        <w:t>Dimensões avaliadas</w:t>
+      </w:r>
+    </w:p>
+    <w:p>
+      <w:pPr>
+        <w:pStyle w:val="ListBullet"/>
+      </w:pPr>
+      <w:r>
+        <w:t>Demandas: volume, ritmo e prazos</w:t>
+      </w:r>
+    </w:p>
+    <w:p>
+      <w:pPr>
+        <w:pStyle w:val="ListBullet"/>
+      </w:pPr>
+      <w:r>
+        <w:t>Controle: autonomia sobre como e quando fazer o trabalho</w:t>
+      </w:r>
+    </w:p>
+    <w:p>
+      <w:pPr>
+        <w:pStyle w:val="ListBullet"/>
+      </w:pPr>
+      <w:r>
+        <w:t>Suporte: apoio da chefia e dos colegas</w:t>
+      </w:r>
+    </w:p>
+    <w:p>
+      <w:pPr>
+        <w:pStyle w:val="ListBullet"/>
+      </w:pPr>
+      <w:r>
+        <w:t>Relacionamentos: conflitos e comportamentos inaceitáveis</w:t>
+      </w:r>
+    </w:p>
+    <w:p>
+      <w:pPr>
+        <w:pStyle w:val="ListBullet"/>
+      </w:pPr>
+      <w:r>
+        <w:t>Papel: clareza de função e responsabilidades</w:t>
+      </w:r>
+    </w:p>
+    <w:p>
+      <w:pPr>
+        <w:pStyle w:val="ListBullet"/>
+      </w:pPr>
+      <w:r>
+        <w:t>Mudanças: como as mudanças são comunicadas e conduzidas</w:t>
+      </w:r>
+    </w:p>
+    <w:p>
+      <w:pPr>
+        <w:pStyle w:val="Heading3"/>
+      </w:pPr>
+      <w:r>
+        <w:t>Exemplos de perguntas (redação adaptada, para ilustrar o formato)</w:t>
+      </w:r>
+    </w:p>
+    <w:p>
+      <w:pPr>
+        <w:pStyle w:val="ListBullet"/>
+      </w:pPr>
+      <w:r>
+        <w:t>Tenho prazos impossíveis de cumprir.</w:t>
+      </w:r>
+    </w:p>
+    <w:p>
+      <w:pPr>
+        <w:pStyle w:val="ListBullet"/>
+      </w:pPr>
+      <w:r>
+        <w:t>Posso decidir quando fazer uma pausa.</w:t>
+      </w:r>
+    </w:p>
+    <w:p>
+      <w:pPr>
+        <w:pStyle w:val="ListBullet"/>
+      </w:pPr>
+      <w:r>
+        <w:t>Recebo apoio do meu gestor em situações emocionalmente difíceis.</w:t>
+      </w:r>
+    </w:p>
+    <w:p>
+      <w:pPr>
+        <w:pStyle w:val="ListBullet"/>
+      </w:pPr>
+      <w:r>
+        <w:t>Sou alvo de intimidação ou assédio no trabalho.</w:t>
+      </w:r>
+    </w:p>
+    <w:p>
+      <w:r>
+        <w:rPr>
+          <w:b/>
+          <w:color w:val="0E2841"/>
+        </w:rPr>
+        <w:t xml:space="preserve">Vantagens: </w:t>
+      </w:r>
+      <w:r>
+        <w:t>curto, fácil de explicar aos empregados e de transformar em plano de ação; tem planilha oficial de apuração.</w:t>
+      </w:r>
+    </w:p>
+    <w:p>
+      <w:r>
+        <w:rPr>
+          <w:b/>
+          <w:color w:val="0E2841"/>
+        </w:rPr>
+        <w:t xml:space="preserve">Limitações: </w:t>
+      </w:r>
+      <w:r>
+        <w:t>original em inglês, sem validação brasileira localizada; não mede jornada nem desconexão.</w:t>
+      </w:r>
+    </w:p>
+    <w:p>
+      <w:r>
+        <w:rPr>
+          <w:b/>
+          <w:color w:val="0E2841"/>
+        </w:rPr>
+        <w:t xml:space="preserve">Fonte: </w:t>
+      </w:r>
+      <w:r>
+        <w:rPr>
+          <w:i w:val="0"/>
+          <w:color w:val="6A7D90"/>
+          <w:sz w:val="17"/>
+        </w:rPr>
+        <w:t>HEALTH AND SAFETY EXECUTIVE. HSE Management Standards Indicator Tool. Reino Unido: HSE, 2004. Site do HSE (hse.gov.uk/stress), com o questionário e a planilha de apuração.</w:t>
+      </w:r>
+    </w:p>
+    <w:p>
+      <w:pPr>
+        <w:pStyle w:val="Heading1"/>
+      </w:pPr>
+      <w:r>
         <w:t>Por que a P&amp;C usa um questionário próprio</w:t>
       </w:r>
     </w:p>
@@ -1320,7 +1555,7 @@
         <w:rPr>
           <w:i w:val="0"/>
         </w:rPr>
-        <w:t>O questionário da Peixoto &amp; Cury é organizado exatamente pelos 13 fatores do guia do MTE e segue as orientações do Manual do GRO (MTE, 2026). Cada item tem como fonte principal o fator correspondente do guia e, quando existe, um item equivalente no COPSOQ II-Br e nos complementares validados no Brasil (Job Stress Scale, ERI e PROART); nos demais, a legislação trabalhista (CLT e Lei nº 14.457/2022). Pergunta sobre as condições e a organização do trabalho, e não sobre sintomas, como orienta o guia, para que o resultado alimente diretamente a AEP e o inventário de riscos do PGR.</w:t>
+        <w:t>O questionário da Peixoto &amp; Cury é organizado exatamente pelos 13 fatores do guia do MTE e segue as orientações do Manual do GRO (MTE, 2026). Cada item tem como fonte principal o fator correspondente do guia e, quando existe, um item equivalente no COPSOQ II-Br e nos complementares validados no Brasil (Job Stress Scale, ERI e PROART), com o HSE Indicator Tool como referência internacional complementar; nos demais, a legislação trabalhista (CLT e Lei nº 14.457/2022). Pergunta sobre as condições e a organização do trabalho, e não sobre sintomas, como orienta o guia, para que o resultado alimente diretamente a AEP e o inventário de riscos do PGR.</w:t>
       </w:r>
     </w:p>
     <w:p>

</xml_diff>